<commit_message>
Final Organisation: Documentation restructure + project info
Documentation:
- Reorganised docs/ into Public/ and Internal/ structure
- Public: DESIGN.md, GAME_RULES.md, PITCH.md, USER_TESTING.md
- Internal: TIMELINE, ASSESSMENT_REQUIREMENTS, PROJECT_EVOLUTION,
  PROJECT_AUDIT, VISIBILITY_REPORT, MIGRATION_CHECKLIST, etc.
- Moved Word docs to output/ (Design, UserTesting, Assessment Brief)
- Removed duplicate generate_docs.py from docs/
- Removed leftover __pycache__

Project Info:
- Updated game title: Eco Rescue FPS → ChainFragrance
- Added Student ID: 2506116
- Added University: Robert Gordon University
- Fixed generate_docs.py placeholders
- Fixed FixGameplayAssets.cs comment

Cleanup:
- Removed 3.9GB leftover TerrainDemoScene_URP/ folder
- Updated .gitignore to track docs/
</commit_message>
<xml_diff>
--- a/output/CM2121_Project_Documentation.docx
+++ b/output/CM2121_Project_Documentation.docx
@@ -125,7 +125,7 @@
           <w:color w:val="3C3C3C"/>
           <w:sz w:val="24"/>
         </w:rPr>
-        <w:t>[ID Placeholder]</w:t>
+        <w:t>2506116</w:t>
       </w:r>
     </w:p>
     <w:p>
@@ -144,7 +144,7 @@
           <w:color w:val="3C3C3C"/>
           <w:sz w:val="24"/>
         </w:rPr>
-        <w:t>[University Name]</w:t>
+        <w:t>Robert Gordon University</w:t>
       </w:r>
     </w:p>
     <w:p>

</xml_diff>